<commit_message>
Update B.Sc. Graduation Project Preliminary Pages (Thesis_Preliminary_Pages.docx) to comply with FUK guidelines
</commit_message>
<xml_diff>
--- a/Thesis_Preliminary_Pages.docx
+++ b/Thesis_Preliminary_Pages.docx
@@ -25,16 +25,21 @@
         <w:t>BY</w:t>
         <w:br/>
         <w:br/>
-        <w:t>MUHAMMAD SAGIR AUWAL</w:t>
-        <w:br/>
-        <w:t>(Matric Number: U19/CS/2004)</w:t>
-        <w:br/>
-        <w:br/>
-        <w:br/>
+      </w:r>
+      <w:r>
+        <w:rPr>
+          <w:b/>
+          <w:sz w:val="24"/>
+        </w:rPr>
+        <w:t>MUHAMMAD, Sagir Auwal</w:t>
         <w:br/>
       </w:r>
       <w:r>
-        <w:t>A Graduation Project Report Submitted to the Department of Computer Science, Ahmadu Bello University, Zaria, in Partial Fulfillment of the Requirements for the Award of Bachelor of Science (B.Sc. Hons) Degree in Computer Science</w:t>
+        <w:rPr>
+          <w:b/>
+          <w:sz w:val="24"/>
+        </w:rPr>
+        <w:t>FUK/SCI/19/COM/0004</w:t>
         <w:br/>
         <w:br/>
         <w:br/>
@@ -44,7 +49,23 @@
         <w:rPr>
           <w:b/>
         </w:rPr>
-        <w:t>JUNE, 2026</w:t>
+        <w:t>MATHEMATICS AND COMPUTER SCIENCE DEPARTMENT</w:t>
+        <w:br/>
+        <w:t>FACULTY OF SCIENCE</w:t>
+        <w:br/>
+        <w:t>FEDERAL UNIVERSITY OF KASHERE</w:t>
+        <w:br/>
+        <w:t>GOMBE STATE</w:t>
+        <w:br/>
+        <w:br/>
+        <w:br/>
+        <w:br/>
+      </w:r>
+      <w:r>
+        <w:rPr>
+          <w:b/>
+        </w:rPr>
+        <w:t>JULY, 2026</w:t>
       </w:r>
     </w:p>
     <w:p>
@@ -54,7 +75,72 @@
     </w:p>
     <w:p>
       <w:pPr>
-        <w:spacing w:line="480" w:lineRule="auto" w:before="0" w:after="360"/>
+        <w:spacing w:before="600" w:line="480" w:lineRule="auto"/>
+        <w:jc w:val="center"/>
+      </w:pPr>
+      <w:r>
+        <w:rPr>
+          <w:b/>
+          <w:sz w:val="28"/>
+        </w:rPr>
+        <w:t>DESIGN AND IMPLEMENTATION OF AN OFFLINE INTELLIGENT DOCUMENT ANALYSIS AND LEARNING ASSISTANT SYSTEM (AuraQA)</w:t>
+        <w:br/>
+        <w:br/>
+        <w:br/>
+        <w:br/>
+      </w:r>
+      <w:r>
+        <w:rPr>
+          <w:b/>
+        </w:rPr>
+        <w:t>BY</w:t>
+        <w:br/>
+        <w:br/>
+      </w:r>
+      <w:r>
+        <w:rPr>
+          <w:b/>
+          <w:sz w:val="24"/>
+        </w:rPr>
+        <w:t>MUHAMMAD, Sagir Auwal</w:t>
+        <w:br/>
+      </w:r>
+      <w:r>
+        <w:rPr>
+          <w:b/>
+          <w:sz w:val="24"/>
+        </w:rPr>
+        <w:t>FUK/SCI/19/COM/0004</w:t>
+        <w:br/>
+        <w:br/>
+        <w:br/>
+        <w:br/>
+      </w:r>
+      <w:r>
+        <w:rPr>
+          <w:sz w:val="24"/>
+        </w:rPr>
+        <w:t>BEING AN UNDERGRADUATE PROJECT REPORT SUBMITTED TO THE DEPARTMENT OF MATHEMATICS AND COMPUTER SCIENCE, FACULTY OF SCIENCE, FEDERAL UNIVERSITY OF KASHERE, IN PARTIAL FULFILMENT OF THE REQUIREMENT FOR THE AWARD DEGREE OF BACHELOR OF SCIENCE (B.Sc.) IN COMPUTER SCIENCE</w:t>
+        <w:br/>
+        <w:br/>
+        <w:br/>
+        <w:br/>
+      </w:r>
+      <w:r>
+        <w:rPr>
+          <w:b/>
+        </w:rPr>
+        <w:t>JULY, 2026</w:t>
+      </w:r>
+    </w:p>
+    <w:p>
+      <w:r>
+        <w:br w:type="page"/>
+      </w:r>
+    </w:p>
+    <w:p>
+      <w:pPr>
+        <w:spacing w:line="480" w:lineRule="auto" w:before="480" w:after="360"/>
         <w:jc w:val="center"/>
       </w:pPr>
       <w:r>
@@ -68,11 +154,11 @@
     </w:p>
     <w:p>
       <w:pPr>
-        <w:spacing w:line="480" w:lineRule="auto" w:after="0" w:before="0"/>
-        <w:ind w:firstLine="720"/>
+        <w:spacing w:line="480" w:lineRule="auto" w:before="0" w:after="240"/>
+        <w:ind w:firstLine="0"/>
       </w:pPr>
       <w:r>
-        <w:t>I, MUHAMMAD SAGIR AUWAL, declare that this graduation project report titled "Design and Implementation of an Offline Intelligent Document Analysis and Learning Assistant System (AuraQA)" is a record of my own research work carried out in the Department of Computer Science, Ahmadu Bello University, Zaria, Nigeria. This work has not been previously submitted, in part or full, for the award of any other degree or diploma in this or any other institution.</w:t>
+        <w:t>I hereby declare that this project titled: "Design and Implementation of an Offline Intelligent Document Analysis and Learning Assistant System (AuraQA)" is a collection of my original research work and it has not been presented for any other qualification anywhere. Information from other sources (published or unpublished) has been duly acknowledged.</w:t>
       </w:r>
     </w:p>
     <w:p>
@@ -83,21 +169,18 @@
         <w:rPr>
           <w:rFonts w:ascii="Times New Roman" w:hAnsi="Times New Roman"/>
         </w:rPr>
-        <w:t>___________________________________</w:t>
-        <w:tab/>
-        <w:tab/>
-        <w:tab/>
+        <w:t>MUHAMMAD, Sagir Auwal</w:t>
+        <w:br/>
+        <w:t>FUK/SCI/19/COM/0004</w:t>
+        <w:br/>
+        <w:t>FEDERAL UNIVERSITY OF KASHERE,</w:t>
+        <w:br/>
+        <w:t>GOMBE, NIGERIA</w:t>
+        <w:br/>
+        <w:br/>
         <w:t>___________________</w:t>
         <w:br/>
-        <w:t>Muhammad Sagir Auwal</w:t>
-        <w:tab/>
-        <w:tab/>
-        <w:tab/>
-        <w:tab/>
-        <w:tab/>
-        <w:t>Date</w:t>
-        <w:br/>
-        <w:t>(Candidate)</w:t>
+        <w:t>SIGNATURE &amp; DATE</w:t>
       </w:r>
     </w:p>
     <w:p>
@@ -107,7 +190,7 @@
     </w:p>
     <w:p>
       <w:pPr>
-        <w:spacing w:line="480" w:lineRule="auto" w:before="0" w:after="360"/>
+        <w:spacing w:line="480" w:lineRule="auto" w:before="480" w:after="360"/>
         <w:jc w:val="center"/>
       </w:pPr>
       <w:r>
@@ -121,11 +204,11 @@
     </w:p>
     <w:p>
       <w:pPr>
-        <w:spacing w:line="480" w:lineRule="auto" w:after="0" w:before="0"/>
-        <w:ind w:firstLine="720"/>
+        <w:spacing w:line="480" w:lineRule="auto" w:before="0" w:after="240"/>
+        <w:ind w:firstLine="0"/>
       </w:pPr>
       <w:r>
-        <w:t>This graduation project report titled "Design and Implementation of an Offline Intelligent Document Analysis and Learning Assistant System (AuraQA)" by MUHAMMAD SAGIR AUWAL meets the regulations governing the award of the degree of Bachelor of Science (B.Sc. Hons) in Computer Science of Ahmadu Bello University, Zaria, and is approved for its contribution to scientific knowledge and literary presentation.</w:t>
+        <w:t>The project titled: "Design and Implementation of an Offline Intelligent Document Analysis and Learning Assistant System (AuraQA)" by MUHAMMAD, Sagir Auwal (FUK/SCI/19/COM/0004) meets the Regulations of the degree of Bachelor of Science (B.Sc.) of the Federal University of Kashere, Gombe and it is approved for its contribution to scientific knowledge and literary presentation.</w:t>
       </w:r>
     </w:p>
     <w:p>
@@ -147,9 +230,9 @@
           <w:rFonts w:ascii="Times New Roman" w:hAnsi="Times New Roman"/>
           <w:b/>
         </w:rPr>
-        <w:t>Dr. A. B. Ibrahim</w:t>
+        <w:t>Dr. David Oyewola</w:t>
         <w:br/>
-        <w:t>(Project Supervisor)</w:t>
+        <w:t>(SUPERVISOR)</w:t>
       </w:r>
     </w:p>
     <w:p>
@@ -171,9 +254,9 @@
           <w:rFonts w:ascii="Times New Roman" w:hAnsi="Times New Roman"/>
           <w:b/>
         </w:rPr>
-        <w:t>Prof. C. D. Aliyu</w:t>
+        <w:t>Dr. (Mrs.) Asabe</w:t>
         <w:br/>
-        <w:t>(Head of Department)</w:t>
+        <w:t>(HEAD OF DEPARTMENT)</w:t>
       </w:r>
     </w:p>
     <w:p>
@@ -195,9 +278,9 @@
           <w:rFonts w:ascii="Times New Roman" w:hAnsi="Times New Roman"/>
           <w:b/>
         </w:rPr>
-        <w:t>[External Examiner Name]</w:t>
+        <w:t>NAME:_______________________</w:t>
         <w:br/>
-        <w:t>(External Examiner)</w:t>
+        <w:t>(EXTERNAL EXAMINER)</w:t>
       </w:r>
     </w:p>
     <w:p>
@@ -207,7 +290,7 @@
     </w:p>
     <w:p>
       <w:pPr>
-        <w:spacing w:line="480" w:lineRule="auto" w:before="0" w:after="360"/>
+        <w:spacing w:line="480" w:lineRule="auto" w:before="480" w:after="360"/>
         <w:jc w:val="center"/>
       </w:pPr>
       <w:r>
@@ -229,14 +312,14 @@
           <w:rFonts w:ascii="Times New Roman" w:hAnsi="Times New Roman"/>
           <w:i/>
         </w:rPr>
-        <w:t>This research project is dedicated to my beloved parents,</w:t>
+        <w:t>This graduation project is dedicated to my parents,</w:t>
         <w:br/>
-        <w:t>whose prayers, support, and sacrifice laid the foundation of my education.</w:t>
+        <w:t>for their prayers, financial support, and moral guidance throughout my studies.</w:t>
         <w:br/>
         <w:br/>
-        <w:t>It is also dedicated to my siblings, mentors, and friends,</w:t>
+        <w:t>It is also dedicated to my supervisor and lecturers,</w:t>
         <w:br/>
-        <w:t>for their encouragement, support, and belief in my academic endeavors.</w:t>
+        <w:t>whose mentorship, guidance, and criticism shaped my academic path.</w:t>
       </w:r>
     </w:p>
     <w:p>
@@ -246,7 +329,7 @@
     </w:p>
     <w:p>
       <w:pPr>
-        <w:spacing w:line="480" w:lineRule="auto" w:before="0" w:after="360"/>
+        <w:spacing w:line="480" w:lineRule="auto" w:before="480" w:after="360"/>
         <w:jc w:val="center"/>
       </w:pPr>
       <w:r>
@@ -260,38 +343,47 @@
     </w:p>
     <w:p>
       <w:pPr>
-        <w:spacing w:line="480" w:lineRule="auto" w:after="0" w:before="0"/>
-        <w:ind w:firstLine="720"/>
+        <w:spacing w:line="480" w:lineRule="auto" w:before="0" w:after="240"/>
+        <w:ind w:firstLine="0"/>
       </w:pPr>
       <w:r>
-        <w:t>First and foremost, I offer my ultimate gratitude to Almighty Allah (SWT), the most Gracious, the most Merciful, whose divine guidance, strength, and infinite mercy made this research project a successful reality.</w:t>
+        <w:t>I want to give thanks to the Almighty God for his grace; also for the protection he gave me all through the course of my study.</w:t>
       </w:r>
     </w:p>
     <w:p>
       <w:pPr>
-        <w:spacing w:line="480" w:lineRule="auto" w:after="0" w:before="0"/>
-        <w:ind w:firstLine="720"/>
+        <w:spacing w:line="480" w:lineRule="auto" w:before="0" w:after="240"/>
+        <w:ind w:firstLine="0"/>
       </w:pPr>
       <w:r>
-        <w:t>My deep appreciation goes to my academic supervisor, Dr. A. B. Ibrahim, for his invaluable supervision, constructive criticisms, and patient guidance throughout the stages of this project. His academic rigor and support greatly influenced the engineering design of the AuraQA platform.</w:t>
+        <w:t>Special thanks to Mrs Christiana Olanipekun for initiating my plans to further this programme. Not to forget specially my wife who sacrificed her love and time to support me.</w:t>
       </w:r>
     </w:p>
     <w:p>
       <w:pPr>
-        <w:spacing w:line="480" w:lineRule="auto" w:after="0" w:before="0"/>
-        <w:ind w:firstLine="720"/>
+        <w:spacing w:line="480" w:lineRule="auto" w:before="0" w:after="240"/>
+        <w:ind w:firstLine="0"/>
       </w:pPr>
       <w:r>
-        <w:t>I am highly indebted to the Head of the Department of Computer Science, Prof. C. D. Aliyu, and all the academic and non-academic staff of the Department of Computer Science, Ahmadu Bello University, Zaria, for the knowledge, guidance, and mentorship provided throughout my undergraduate program.</w:t>
+        <w:t>Great thanks to my supervisor, Dr. David Oyewola who sacrificed his time and resources to scrutinize this project and support me.</w:t>
       </w:r>
     </w:p>
     <w:p>
       <w:pPr>
-        <w:spacing w:line="480" w:lineRule="auto" w:after="0" w:before="0"/>
-        <w:ind w:firstLine="720"/>
+        <w:spacing w:line="480" w:lineRule="auto" w:before="0" w:after="240"/>
+        <w:ind w:firstLine="0"/>
       </w:pPr>
       <w:r>
-        <w:t>Finally, my profound appreciation goes to my parents, family, and undergraduate colleagues for their prayers, financial support, encouragement, and camaraderie throughout my academic journey. May Allah reward you all abundantly.</w:t>
+        <w:t>I cannot fail to acknowledge my friends – Alaba, Williams Narh and also Mr Ebenezer Afful who did not live to see the completion of this project. I am grateful to you all.</w:t>
+      </w:r>
+    </w:p>
+    <w:p>
+      <w:pPr>
+        <w:spacing w:line="480" w:lineRule="auto" w:before="0" w:after="240"/>
+        <w:ind w:firstLine="0"/>
+      </w:pPr>
+      <w:r>
+        <w:t>I owe a depth of gratitude to myself for patience, perseverance, courage, endurance and sheer determination to attain the present status in life.</w:t>
       </w:r>
     </w:p>
     <w:p>
@@ -301,7 +393,7 @@
     </w:p>
     <w:p>
       <w:pPr>
-        <w:spacing w:line="480" w:lineRule="auto" w:before="0" w:after="360"/>
+        <w:spacing w:line="480" w:lineRule="auto" w:before="480" w:after="360"/>
         <w:jc w:val="center"/>
       </w:pPr>
       <w:r>
@@ -315,30 +407,11 @@
     </w:p>
     <w:p>
       <w:pPr>
-        <w:spacing w:line="480" w:lineRule="auto" w:after="0" w:before="0"/>
-        <w:ind w:firstLine="720"/>
+        <w:spacing w:line="240" w:lineRule="auto" w:before="0" w:after="240"/>
+        <w:ind w:firstLine="0"/>
       </w:pPr>
       <w:r>
-        <w:t>The adoption of Large Language Models (LLMs) in enterprise and academic workflows introduces significant data sovereignty, intellectual property, and latency challenges when relying on cloud endpoints. This study designs, implements, and evaluates AuraQA, a secure, 100% offline document Retrieval-Augmented Generation (RAG) and learning assistant system optimized for standard consumer-grade CPUs. Adopting the Prototyping System Development Life Cycle (SDLC) methodology, the system integrates multilingual document text extractors (PDF, DOCX, TXT, CSV), a local dense vector store utilizing Facebook AI Similarity Search (FAISS), and an out-of-scope grounding shield. To eliminate the high CPU latency associated with LLM prompt prefill, an optimized paragraph segmentation pipeline chunks text into 1000-character segments with a 150-character overlap. Additionally, a fast, deterministic keyword-based query classifier handles greetings and out-of-scope validation without model intervention, bypassing slow neural prefill evaluations. Performance evaluations show that the optimized RAG pipeline reduces overall query latency by 48.57% (from 71.69 seconds down to 36.87 seconds) on an Intel Core i5 CPU, while query classification latency is reduced to 0.00 seconds. The out-of-scope safety shield effectively prevents LLM hallucinations by bypassing inference on queries falling below a 0.40 similarity threshold. AuraQA maintains high semantic accuracy across six whitelisted languages (English, French, Spanish, German, Arabic, and Hausa), providing a localized, privacy-first cognitive assistant that operates securely within offline environments.</w:t>
-      </w:r>
-    </w:p>
-    <w:p>
-      <w:pPr>
-        <w:spacing w:line="480" w:lineRule="auto" w:before="240"/>
-        <w:ind w:firstLine="720"/>
-      </w:pPr>
-      <w:r>
-        <w:rPr>
-          <w:rFonts w:ascii="Times New Roman" w:hAnsi="Times New Roman"/>
-          <w:b/>
-        </w:rPr>
-        <w:t xml:space="preserve">Keywords: </w:t>
-      </w:r>
-      <w:r>
-        <w:rPr>
-          <w:rFonts w:ascii="Times New Roman" w:hAnsi="Times New Roman"/>
-        </w:rPr>
-        <w:t>Retrieval-Augmented Generation (RAG), Local LLM, CPU Ingestion, FAISS, Query Routing, Data Sovereignty, Hausa, Out-of-Scope Shield.</w:t>
+        <w:t>The integration of conversational Large Language Models (LLMs) inside private corporate and academic research workflows exposes critical vulnerabilities in data sovereignty, security, and document context retention. Standalone local language models deployed on consumer-grade CPU hardware suffer from high token prefill latency during prompt evaluations, semantic context truncation due to sequence length limitations of multilingual embeddings, and compute-heavy hallucinations on out-of-scope queries. This study designs, implements, and evaluates AuraQA, a secure, 100% offline document question-answering and learning assistant system optimized to run on standard CPUs. Utilizing the Prototyping Software Development Life Cycle (SDLC) framework, the architecture integrates a local multi-format document parser (PDF, DOCX, TXT, CSV), a dense semantic retrieval vector database using Facebook AI Similarity Search (FAISS), and an out-of-scope grounding shield. To optimize CPU inference, document chunks are formatted to 1000-character segments with 150-character overlaps, aligning them with the limits of the sentence-transformer embedding model. Furthermore, a fast, deterministic keyword-based query classifier handles greetings and out-of-scope queries, bypassing slow neural model evaluations entirely. Benchmarks reveal that the optimized RAG pipeline reduces overall query execution latency by 48.57% (from 71.69 seconds down to 36.87 seconds) on an Intel Core i5 CPU. The query classifier reduces routing latency to 0.00 seconds. The out-of-scope grounding shield effectively bypasses LLM inference on off-topic inputs falling below a 0.40 cosine similarity threshold. The system preserves data privacy offline while maintaining retrieval accuracy across six whitelisted languages (English, French, Spanish, German, Arabic, and Hausa).</w:t>
       </w:r>
     </w:p>
     <w:p>
@@ -348,7 +421,7 @@
     </w:p>
     <w:p>
       <w:pPr>
-        <w:spacing w:line="480" w:lineRule="auto" w:before="0" w:after="360"/>
+        <w:spacing w:line="480" w:lineRule="auto" w:before="480" w:after="360"/>
         <w:jc w:val="center"/>
       </w:pPr>
       <w:r>
@@ -369,13 +442,39 @@
           <w:rFonts w:ascii="Times New Roman" w:hAnsi="Times New Roman"/>
           <w:b/>
         </w:rPr>
-        <w:t xml:space="preserve">Title Page </w:t>
+        <w:t>Content</w:t>
+      </w:r>
+      <w:r>
+        <w:tab/>
+        <w:tab/>
+        <w:tab/>
+        <w:tab/>
+        <w:tab/>
+      </w:r>
+      <w:r>
+        <w:rPr>
+          <w:rFonts w:ascii="Times New Roman" w:hAnsi="Times New Roman"/>
+          <w:b/>
+        </w:rPr>
+        <w:t>Page</w:t>
+      </w:r>
+    </w:p>
+    <w:p>
+      <w:pPr>
+        <w:spacing w:line="480" w:lineRule="auto" w:before="0" w:after="0"/>
+      </w:pPr>
+      <w:r>
+        <w:rPr>
+          <w:rFonts w:ascii="Times New Roman" w:hAnsi="Times New Roman"/>
+          <w:b/>
+        </w:rPr>
+        <w:t xml:space="preserve">Cover Page </w:t>
       </w:r>
       <w:r>
         <w:rPr>
           <w:rFonts w:ascii="Times New Roman" w:hAnsi="Times New Roman"/>
         </w:rPr>
-        <w:t>..........................................................................</w:t>
+        <w:t>.....................................................................</w:t>
       </w:r>
       <w:r>
         <w:rPr>
@@ -394,13 +493,13 @@
           <w:rFonts w:ascii="Times New Roman" w:hAnsi="Times New Roman"/>
           <w:b/>
         </w:rPr>
-        <w:t xml:space="preserve">Declaration </w:t>
+        <w:t xml:space="preserve">Title Page </w:t>
       </w:r>
       <w:r>
         <w:rPr>
           <w:rFonts w:ascii="Times New Roman" w:hAnsi="Times New Roman"/>
         </w:rPr>
-        <w:t>........................................................................</w:t>
+        <w:t>....................................................................</w:t>
       </w:r>
       <w:r>
         <w:rPr>
@@ -419,13 +518,13 @@
           <w:rFonts w:ascii="Times New Roman" w:hAnsi="Times New Roman"/>
           <w:b/>
         </w:rPr>
-        <w:t xml:space="preserve">Certification </w:t>
+        <w:t xml:space="preserve">Declaration </w:t>
       </w:r>
       <w:r>
         <w:rPr>
           <w:rFonts w:ascii="Times New Roman" w:hAnsi="Times New Roman"/>
         </w:rPr>
-        <w:t>.....................................................................</w:t>
+        <w:t>..................................................................</w:t>
       </w:r>
       <w:r>
         <w:rPr>
@@ -444,13 +543,13 @@
           <w:rFonts w:ascii="Times New Roman" w:hAnsi="Times New Roman"/>
           <w:b/>
         </w:rPr>
-        <w:t xml:space="preserve">Dedication </w:t>
+        <w:t xml:space="preserve">Certification </w:t>
       </w:r>
       <w:r>
         <w:rPr>
           <w:rFonts w:ascii="Times New Roman" w:hAnsi="Times New Roman"/>
         </w:rPr>
-        <w:t>.........................................................................</w:t>
+        <w:t>.................................................................</w:t>
       </w:r>
       <w:r>
         <w:rPr>
@@ -467,15 +566,14 @@
       <w:r>
         <w:rPr>
           <w:rFonts w:ascii="Times New Roman" w:hAnsi="Times New Roman"/>
-          <w:b/>
         </w:rPr>
-        <w:t xml:space="preserve">Acknowledgements </w:t>
+        <w:t xml:space="preserve">Dedication </w:t>
       </w:r>
       <w:r>
         <w:rPr>
           <w:rFonts w:ascii="Times New Roman" w:hAnsi="Times New Roman"/>
         </w:rPr>
-        <w:t>....................................................................</w:t>
+        <w:t>.....................................................................</w:t>
       </w:r>
       <w:r>
         <w:rPr>
@@ -494,13 +592,13 @@
           <w:rFonts w:ascii="Times New Roman" w:hAnsi="Times New Roman"/>
           <w:b/>
         </w:rPr>
-        <w:t xml:space="preserve">Abstract </w:t>
+        <w:t xml:space="preserve">Acknowledgements </w:t>
       </w:r>
       <w:r>
         <w:rPr>
           <w:rFonts w:ascii="Times New Roman" w:hAnsi="Times New Roman"/>
         </w:rPr>
-        <w:t>...........................................................................</w:t>
+        <w:t>..............................................................</w:t>
       </w:r>
       <w:r>
         <w:rPr>
@@ -519,13 +617,13 @@
           <w:rFonts w:ascii="Times New Roman" w:hAnsi="Times New Roman"/>
           <w:b/>
         </w:rPr>
-        <w:t xml:space="preserve">Table of Contents </w:t>
+        <w:t xml:space="preserve">Abstract </w:t>
       </w:r>
       <w:r>
         <w:rPr>
           <w:rFonts w:ascii="Times New Roman" w:hAnsi="Times New Roman"/>
         </w:rPr>
-        <w:t>.................................................................</w:t>
+        <w:t>.....................................................................</w:t>
       </w:r>
       <w:r>
         <w:rPr>
@@ -544,13 +642,13 @@
           <w:rFonts w:ascii="Times New Roman" w:hAnsi="Times New Roman"/>
           <w:b/>
         </w:rPr>
-        <w:t xml:space="preserve">List of Tables </w:t>
+        <w:t xml:space="preserve">Table of Contents </w:t>
       </w:r>
       <w:r>
         <w:rPr>
           <w:rFonts w:ascii="Times New Roman" w:hAnsi="Times New Roman"/>
         </w:rPr>
-        <w:t>...................................................................</w:t>
+        <w:t>...........................................................</w:t>
       </w:r>
       <w:r>
         <w:rPr>
@@ -569,13 +667,13 @@
           <w:rFonts w:ascii="Times New Roman" w:hAnsi="Times New Roman"/>
           <w:b/>
         </w:rPr>
-        <w:t xml:space="preserve">List of Figures </w:t>
+        <w:t xml:space="preserve">List of Tables </w:t>
       </w:r>
       <w:r>
         <w:rPr>
           <w:rFonts w:ascii="Times New Roman" w:hAnsi="Times New Roman"/>
         </w:rPr>
-        <w:t>....................................................................</w:t>
+        <w:t>................................................................</w:t>
       </w:r>
       <w:r>
         <w:rPr>
@@ -594,13 +692,13 @@
           <w:rFonts w:ascii="Times New Roman" w:hAnsi="Times New Roman"/>
           <w:b/>
         </w:rPr>
-        <w:t xml:space="preserve">List of Abbreviations </w:t>
+        <w:t xml:space="preserve">List of Figures </w:t>
       </w:r>
       <w:r>
         <w:rPr>
           <w:rFonts w:ascii="Times New Roman" w:hAnsi="Times New Roman"/>
         </w:rPr>
-        <w:t>...............................................................</w:t>
+        <w:t>................................................................</w:t>
       </w:r>
       <w:r>
         <w:rPr>
@@ -619,13 +717,38 @@
           <w:rFonts w:ascii="Times New Roman" w:hAnsi="Times New Roman"/>
           <w:b/>
         </w:rPr>
-        <w:t xml:space="preserve">CHAPTER ONE: INTRODUCTION AND BACKGROUND OF THE STUDY </w:t>
+        <w:t xml:space="preserve">List of Abbreviations </w:t>
       </w:r>
       <w:r>
         <w:rPr>
           <w:rFonts w:ascii="Times New Roman" w:hAnsi="Times New Roman"/>
         </w:rPr>
-        <w:t>...............................</w:t>
+        <w:t>.........................................................</w:t>
+      </w:r>
+      <w:r>
+        <w:rPr>
+          <w:rFonts w:ascii="Times New Roman" w:hAnsi="Times New Roman"/>
+          <w:b/>
+        </w:rPr>
+        <w:t xml:space="preserve"> xi</w:t>
+      </w:r>
+    </w:p>
+    <w:p>
+      <w:pPr>
+        <w:spacing w:line="480" w:lineRule="auto" w:before="0" w:after="0"/>
+      </w:pPr>
+      <w:r>
+        <w:rPr>
+          <w:rFonts w:ascii="Times New Roman" w:hAnsi="Times New Roman"/>
+          <w:b/>
+        </w:rPr>
+        <w:t xml:space="preserve">CHAPTER ONE: INTRODUCTION </w:t>
+      </w:r>
+      <w:r>
+        <w:rPr>
+          <w:rFonts w:ascii="Times New Roman" w:hAnsi="Times New Roman"/>
+        </w:rPr>
+        <w:t>......................................................</w:t>
       </w:r>
       <w:r>
         <w:rPr>
@@ -650,7 +773,7 @@
         <w:rPr>
           <w:rFonts w:ascii="Times New Roman" w:hAnsi="Times New Roman"/>
         </w:rPr>
-        <w:t>................................................................</w:t>
+        <w:t>...........................................................</w:t>
       </w:r>
       <w:r>
         <w:rPr>
@@ -675,7 +798,7 @@
         <w:rPr>
           <w:rFonts w:ascii="Times New Roman" w:hAnsi="Times New Roman"/>
         </w:rPr>
-        <w:t>...........................................................</w:t>
+        <w:t>......................................................</w:t>
       </w:r>
       <w:r>
         <w:rPr>
@@ -700,7 +823,7 @@
         <w:rPr>
           <w:rFonts w:ascii="Times New Roman" w:hAnsi="Times New Roman"/>
         </w:rPr>
-        <w:t>.....................................................</w:t>
+        <w:t>................................................</w:t>
       </w:r>
       <w:r>
         <w:rPr>
@@ -725,7 +848,7 @@
         <w:rPr>
           <w:rFonts w:ascii="Times New Roman" w:hAnsi="Times New Roman"/>
         </w:rPr>
-        <w:t>..........................................................</w:t>
+        <w:t>.....................................................</w:t>
       </w:r>
       <w:r>
         <w:rPr>
@@ -750,7 +873,7 @@
         <w:rPr>
           <w:rFonts w:ascii="Times New Roman" w:hAnsi="Times New Roman"/>
         </w:rPr>
-        <w:t>...................................................</w:t>
+        <w:t>..............................................</w:t>
       </w:r>
       <w:r>
         <w:rPr>
@@ -775,7 +898,7 @@
         <w:rPr>
           <w:rFonts w:ascii="Times New Roman" w:hAnsi="Times New Roman"/>
         </w:rPr>
-        <w:t>..........................................................</w:t>
+        <w:t>.....................................................</w:t>
       </w:r>
       <w:r>
         <w:rPr>
@@ -800,7 +923,7 @@
         <w:rPr>
           <w:rFonts w:ascii="Times New Roman" w:hAnsi="Times New Roman"/>
         </w:rPr>
-        <w:t>.............................................</w:t>
+        <w:t>........................................</w:t>
       </w:r>
       <w:r>
         <w:rPr>
@@ -825,7 +948,7 @@
         <w:rPr>
           <w:rFonts w:ascii="Times New Roman" w:hAnsi="Times New Roman"/>
         </w:rPr>
-        <w:t>..................................................................</w:t>
+        <w:t>.............................................................</w:t>
       </w:r>
       <w:r>
         <w:rPr>
@@ -850,7 +973,7 @@
         <w:rPr>
           <w:rFonts w:ascii="Times New Roman" w:hAnsi="Times New Roman"/>
         </w:rPr>
-        <w:t>......................................................</w:t>
+        <w:t>.................................................</w:t>
       </w:r>
       <w:r>
         <w:rPr>
@@ -875,7 +998,7 @@
         <w:rPr>
           <w:rFonts w:ascii="Times New Roman" w:hAnsi="Times New Roman"/>
         </w:rPr>
-        <w:t>..............................</w:t>
+        <w:t>.........................</w:t>
       </w:r>
       <w:r>
         <w:rPr>
@@ -900,7 +1023,7 @@
         <w:rPr>
           <w:rFonts w:ascii="Times New Roman" w:hAnsi="Times New Roman"/>
         </w:rPr>
-        <w:t>....................</w:t>
+        <w:t>...............</w:t>
       </w:r>
       <w:r>
         <w:rPr>
@@ -925,7 +1048,7 @@
         <w:rPr>
           <w:rFonts w:ascii="Times New Roman" w:hAnsi="Times New Roman"/>
         </w:rPr>
-        <w:t>.................</w:t>
+        <w:t>............</w:t>
       </w:r>
       <w:r>
         <w:rPr>
@@ -950,7 +1073,7 @@
         <w:rPr>
           <w:rFonts w:ascii="Times New Roman" w:hAnsi="Times New Roman"/>
         </w:rPr>
-        <w:t>..................</w:t>
+        <w:t>.............</w:t>
       </w:r>
       <w:r>
         <w:rPr>
@@ -975,7 +1098,7 @@
         <w:rPr>
           <w:rFonts w:ascii="Times New Roman" w:hAnsi="Times New Roman"/>
         </w:rPr>
-        <w:t>.............................................</w:t>
+        <w:t>........................................</w:t>
       </w:r>
       <w:r>
         <w:rPr>
@@ -994,13 +1117,13 @@
           <w:rFonts w:ascii="Times New Roman" w:hAnsi="Times New Roman"/>
           <w:b/>
         </w:rPr>
-        <w:t xml:space="preserve">CHAPTER THREE: SYSTEM DESIGN AND METHODOLOGY </w:t>
+        <w:t xml:space="preserve">CHAPTER THREE: MATERIALS AND METHODS/RESEARCH METHODOLOGY </w:t>
       </w:r>
       <w:r>
         <w:rPr>
           <w:rFonts w:ascii="Times New Roman" w:hAnsi="Times New Roman"/>
         </w:rPr>
-        <w:t>.......................................</w:t>
+        <w:t>.....................</w:t>
       </w:r>
       <w:r>
         <w:rPr>
@@ -1025,7 +1148,7 @@
         <w:rPr>
           <w:rFonts w:ascii="Times New Roman" w:hAnsi="Times New Roman"/>
         </w:rPr>
-        <w:t>...............................</w:t>
+        <w:t>..........................</w:t>
       </w:r>
       <w:r>
         <w:rPr>
@@ -1050,7 +1173,7 @@
         <w:rPr>
           <w:rFonts w:ascii="Times New Roman" w:hAnsi="Times New Roman"/>
         </w:rPr>
-        <w:t>.............................</w:t>
+        <w:t>........................</w:t>
       </w:r>
       <w:r>
         <w:rPr>
@@ -1075,7 +1198,7 @@
         <w:rPr>
           <w:rFonts w:ascii="Times New Roman" w:hAnsi="Times New Roman"/>
         </w:rPr>
-        <w:t>....................</w:t>
+        <w:t>...............</w:t>
       </w:r>
       <w:r>
         <w:rPr>
@@ -1100,7 +1223,7 @@
         <w:rPr>
           <w:rFonts w:ascii="Times New Roman" w:hAnsi="Times New Roman"/>
         </w:rPr>
-        <w:t>........................</w:t>
+        <w:t>...................</w:t>
       </w:r>
       <w:r>
         <w:rPr>
@@ -1125,7 +1248,7 @@
         <w:rPr>
           <w:rFonts w:ascii="Times New Roman" w:hAnsi="Times New Roman"/>
         </w:rPr>
-        <w:t>..................</w:t>
+        <w:t>.............</w:t>
       </w:r>
       <w:r>
         <w:rPr>
@@ -1150,7 +1273,7 @@
         <w:rPr>
           <w:rFonts w:ascii="Times New Roman" w:hAnsi="Times New Roman"/>
         </w:rPr>
-        <w:t>.........................</w:t>
+        <w:t>....................</w:t>
       </w:r>
       <w:r>
         <w:rPr>
@@ -1169,13 +1292,13 @@
           <w:rFonts w:ascii="Times New Roman" w:hAnsi="Times New Roman"/>
           <w:b/>
         </w:rPr>
-        <w:t xml:space="preserve">CHAPTER FOUR: SYSTEM IMPLEMENTATION AND EVALUATION </w:t>
+        <w:t xml:space="preserve">CHAPTER FOUR: RESULTS AND DISCUSSION </w:t>
       </w:r>
       <w:r>
         <w:rPr>
           <w:rFonts w:ascii="Times New Roman" w:hAnsi="Times New Roman"/>
         </w:rPr>
-        <w:t>.................................</w:t>
+        <w:t>..........................................</w:t>
       </w:r>
       <w:r>
         <w:rPr>
@@ -1200,7 +1323,7 @@
         <w:rPr>
           <w:rFonts w:ascii="Times New Roman" w:hAnsi="Times New Roman"/>
         </w:rPr>
-        <w:t>.................................</w:t>
+        <w:t>............................</w:t>
       </w:r>
       <w:r>
         <w:rPr>
@@ -1225,7 +1348,7 @@
         <w:rPr>
           <w:rFonts w:ascii="Times New Roman" w:hAnsi="Times New Roman"/>
         </w:rPr>
-        <w:t>..............................</w:t>
+        <w:t>.........................</w:t>
       </w:r>
       <w:r>
         <w:rPr>
@@ -1250,7 +1373,7 @@
         <w:rPr>
           <w:rFonts w:ascii="Times New Roman" w:hAnsi="Times New Roman"/>
         </w:rPr>
-        <w:t>..........................</w:t>
+        <w:t>.....................</w:t>
       </w:r>
       <w:r>
         <w:rPr>
@@ -1275,7 +1398,7 @@
         <w:rPr>
           <w:rFonts w:ascii="Times New Roman" w:hAnsi="Times New Roman"/>
         </w:rPr>
-        <w:t>.....................................................</w:t>
+        <w:t>................................................</w:t>
       </w:r>
       <w:r>
         <w:rPr>
@@ -1294,13 +1417,13 @@
           <w:rFonts w:ascii="Times New Roman" w:hAnsi="Times New Roman"/>
           <w:b/>
         </w:rPr>
-        <w:t xml:space="preserve">CHAPTER FIVE: SUMMARY, CONCLUSION, AND RECOMMENDATIONS </w:t>
+        <w:t xml:space="preserve">CHAPTER FIVE: CONCLUSION AND RECOMMENDATION </w:t>
       </w:r>
       <w:r>
         <w:rPr>
           <w:rFonts w:ascii="Times New Roman" w:hAnsi="Times New Roman"/>
         </w:rPr>
-        <w:t>.............................</w:t>
+        <w:t>...................................</w:t>
       </w:r>
       <w:r>
         <w:rPr>
@@ -1325,7 +1448,7 @@
         <w:rPr>
           <w:rFonts w:ascii="Times New Roman" w:hAnsi="Times New Roman"/>
         </w:rPr>
-        <w:t>........................................................</w:t>
+        <w:t>...................................................</w:t>
       </w:r>
       <w:r>
         <w:rPr>
@@ -1350,7 +1473,7 @@
         <w:rPr>
           <w:rFonts w:ascii="Times New Roman" w:hAnsi="Times New Roman"/>
         </w:rPr>
-        <w:t>.................................................................</w:t>
+        <w:t>............................................................</w:t>
       </w:r>
       <w:r>
         <w:rPr>
@@ -1375,7 +1498,7 @@
         <w:rPr>
           <w:rFonts w:ascii="Times New Roman" w:hAnsi="Times New Roman"/>
         </w:rPr>
-        <w:t>............................................................</w:t>
+        <w:t>.......................................................</w:t>
       </w:r>
       <w:r>
         <w:rPr>
@@ -1394,13 +1517,13 @@
           <w:rFonts w:ascii="Times New Roman" w:hAnsi="Times New Roman"/>
         </w:rPr>
         <w:tab/>
-        <w:t xml:space="preserve">5.4 Appendix </w:t>
+        <w:t xml:space="preserve">5.4 References </w:t>
       </w:r>
       <w:r>
         <w:rPr>
           <w:rFonts w:ascii="Times New Roman" w:hAnsi="Times New Roman"/>
         </w:rPr>
-        <w:t>...................................................................</w:t>
+        <w:t>............................................................</w:t>
       </w:r>
       <w:r>
         <w:rPr>
@@ -1411,13 +1534,38 @@
       </w:r>
     </w:p>
     <w:p>
+      <w:pPr>
+        <w:spacing w:line="480" w:lineRule="auto" w:before="0" w:after="0"/>
+      </w:pPr>
+      <w:r>
+        <w:rPr>
+          <w:rFonts w:ascii="Times New Roman" w:hAnsi="Times New Roman"/>
+        </w:rPr>
+        <w:tab/>
+        <w:t xml:space="preserve">5.5 Appendix </w:t>
+      </w:r>
+      <w:r>
+        <w:rPr>
+          <w:rFonts w:ascii="Times New Roman" w:hAnsi="Times New Roman"/>
+        </w:rPr>
+        <w:t>..............................................................</w:t>
+      </w:r>
+      <w:r>
+        <w:rPr>
+          <w:rFonts w:ascii="Times New Roman" w:hAnsi="Times New Roman"/>
+          <w:b/>
+        </w:rPr>
+        <w:t xml:space="preserve"> 58</w:t>
+      </w:r>
+    </w:p>
+    <w:p>
       <w:r>
         <w:br w:type="page"/>
       </w:r>
     </w:p>
     <w:p>
       <w:pPr>
-        <w:spacing w:line="480" w:lineRule="auto" w:before="0" w:after="360"/>
+        <w:spacing w:line="480" w:lineRule="auto" w:before="480" w:after="360"/>
         <w:jc w:val="center"/>
       </w:pPr>
       <w:r>
@@ -1443,7 +1591,7 @@
         <w:rPr>
           <w:rFonts w:ascii="Times New Roman" w:hAnsi="Times New Roman"/>
         </w:rPr>
-        <w:t>........................</w:t>
+        <w:t>...................</w:t>
       </w:r>
       <w:r>
         <w:rPr>
@@ -1467,7 +1615,7 @@
         <w:rPr>
           <w:rFonts w:ascii="Times New Roman" w:hAnsi="Times New Roman"/>
         </w:rPr>
-        <w:t>.......................</w:t>
+        <w:t>..................</w:t>
       </w:r>
       <w:r>
         <w:rPr>
@@ -1491,7 +1639,7 @@
         <w:rPr>
           <w:rFonts w:ascii="Times New Roman" w:hAnsi="Times New Roman"/>
         </w:rPr>
-        <w:t>..............................................</w:t>
+        <w:t>.........................................</w:t>
       </w:r>
       <w:r>
         <w:rPr>
@@ -1515,7 +1663,7 @@
         <w:rPr>
           <w:rFonts w:ascii="Times New Roman" w:hAnsi="Times New Roman"/>
         </w:rPr>
-        <w:t>.............</w:t>
+        <w:t>........</w:t>
       </w:r>
       <w:r>
         <w:rPr>
@@ -1532,7 +1680,7 @@
     </w:p>
     <w:p>
       <w:pPr>
-        <w:spacing w:line="480" w:lineRule="auto" w:before="0" w:after="360"/>
+        <w:spacing w:line="480" w:lineRule="auto" w:before="480" w:after="360"/>
         <w:jc w:val="center"/>
       </w:pPr>
       <w:r>
@@ -1558,7 +1706,7 @@
         <w:rPr>
           <w:rFonts w:ascii="Times New Roman" w:hAnsi="Times New Roman"/>
         </w:rPr>
-        <w:t>.........................</w:t>
+        <w:t>....................</w:t>
       </w:r>
       <w:r>
         <w:rPr>
@@ -1582,7 +1730,7 @@
         <w:rPr>
           <w:rFonts w:ascii="Times New Roman" w:hAnsi="Times New Roman"/>
         </w:rPr>
-        <w:t>...........................</w:t>
+        <w:t>......................</w:t>
       </w:r>
       <w:r>
         <w:rPr>
@@ -1606,7 +1754,7 @@
         <w:rPr>
           <w:rFonts w:ascii="Times New Roman" w:hAnsi="Times New Roman"/>
         </w:rPr>
-        <w:t>................................</w:t>
+        <w:t>...........................</w:t>
       </w:r>
       <w:r>
         <w:rPr>
@@ -1630,7 +1778,7 @@
         <w:rPr>
           <w:rFonts w:ascii="Times New Roman" w:hAnsi="Times New Roman"/>
         </w:rPr>
-        <w:t>..................</w:t>
+        <w:t>.............</w:t>
       </w:r>
       <w:r>
         <w:rPr>
@@ -1647,7 +1795,7 @@
     </w:p>
     <w:p>
       <w:pPr>
-        <w:spacing w:line="480" w:lineRule="auto" w:before="0" w:after="360"/>
+        <w:spacing w:line="480" w:lineRule="auto" w:before="480" w:after="360"/>
         <w:jc w:val="center"/>
       </w:pPr>
       <w:r>
@@ -2020,8 +2168,8 @@
       </w:r>
     </w:p>
     <w:sectPr>
-      <w:pgSz w:w="12240" w:h="15840"/>
-      <w:pgMar w:top="1440" w:right="1440" w:bottom="1440" w:left="1440" w:header="720" w:footer="720" w:gutter="0"/>
+      <w:pgSz w:w="11909" w:h="16834"/>
+      <w:pgMar w:top="1440" w:right="1440" w:bottom="1440" w:left="1987" w:header="720" w:footer="720" w:gutter="0"/>
       <w:cols w:space="720"/>
       <w:docGrid w:linePitch="360"/>
     </w:sectPr>

</xml_diff>